<commit_message>
Updating Admin side to the documentation
</commit_message>
<xml_diff>
--- a/ITEC106_Cosmic_Tetris_Documentation.docx
+++ b/ITEC106_Cosmic_Tetris_Documentation.docx
@@ -307,7 +307,10 @@
         <w:jc w:val="center"/>
       </w:pPr>
       <w:r>
-        <w:t>May 2026</w:t>
+        <w:t xml:space="preserve">June </w:t>
+      </w:r>
+      <w:r>
+        <w:t>2026</w:t>
       </w:r>
     </w:p>
     <w:p>
@@ -1199,7 +1202,19 @@
         <w:rPr>
           <w:color w:val="auto"/>
         </w:rPr>
-        <w:t>2.1 Initial Wireframe</w:t>
+        <w:t>2.</w:t>
+      </w:r>
+      <w:r>
+        <w:rPr>
+          <w:color w:val="auto"/>
+        </w:rPr>
+        <w:t>1</w:t>
+      </w:r>
+      <w:r>
+        <w:rPr>
+          <w:color w:val="auto"/>
+        </w:rPr>
+        <w:t xml:space="preserve"> Final UI Design</w:t>
       </w:r>
     </w:p>
     <w:p>
@@ -1209,128 +1224,6 @@
         <w:jc w:val="both"/>
       </w:pPr>
       <w:r>
-        <w:t>Before writing any code, the team sketched wireframes for each of the five core screens: Login, Register, Dashboard (Mission Control), Game Board, and Leaderboard. The initial wireframes focused purely on layout and information hierarchy without any visual styling.</w:t>
-      </w:r>
-    </w:p>
-    <w:p>
-      <w:pPr>
-        <w:spacing w:after="120" w:line="360" w:lineRule="auto"/>
-      </w:pPr>
-    </w:p>
-    <w:p>
-      <w:pPr>
-        <w:spacing w:before="80" w:after="80" w:line="360" w:lineRule="auto"/>
-      </w:pPr>
-      <w:r>
-        <w:rPr>
-          <w:b/>
-          <w:bCs/>
-        </w:rPr>
-        <w:t>Key wireframe decisions were:</w:t>
-      </w:r>
-    </w:p>
-    <w:p>
-      <w:pPr>
-        <w:pStyle w:val="ListParagraph"/>
-        <w:numPr>
-          <w:ilvl w:val="0"/>
-          <w:numId w:val="2"/>
-        </w:numPr>
-        <w:spacing w:before="40" w:after="40" w:line="360" w:lineRule="auto"/>
-        <w:jc w:val="both"/>
-      </w:pPr>
-      <w:r>
-        <w:t>Login &amp; Register: A centered card with labeled form fields (email, username, password), a submit button, and a link to switch between the two screens.</w:t>
-      </w:r>
-    </w:p>
-    <w:p>
-      <w:pPr>
-        <w:pStyle w:val="ListParagraph"/>
-        <w:numPr>
-          <w:ilvl w:val="0"/>
-          <w:numId w:val="2"/>
-        </w:numPr>
-        <w:spacing w:before="40" w:after="40" w:line="360" w:lineRule="auto"/>
-        <w:jc w:val="both"/>
-      </w:pPr>
-      <w:r>
-        <w:t>Dashboard: A card showing the player's personal best score prominently in the center, with two large action buttons (Play and Leaderboard) and a subtle logout link.</w:t>
-      </w:r>
-    </w:p>
-    <w:p>
-      <w:pPr>
-        <w:pStyle w:val="ListParagraph"/>
-        <w:numPr>
-          <w:ilvl w:val="0"/>
-          <w:numId w:val="2"/>
-        </w:numPr>
-        <w:spacing w:before="40" w:after="40" w:line="360" w:lineRule="auto"/>
-        <w:jc w:val="both"/>
-      </w:pPr>
-      <w:r>
-        <w:t>Game Board: A three-column layout — Score panel on the left, the Tetris canvas in the center, and a Next Piece preview with Restart/Quit buttons on the right.</w:t>
-      </w:r>
-    </w:p>
-    <w:p>
-      <w:pPr>
-        <w:pStyle w:val="ListParagraph"/>
-        <w:numPr>
-          <w:ilvl w:val="0"/>
-          <w:numId w:val="2"/>
-        </w:numPr>
-        <w:spacing w:before="40" w:after="40" w:line="360" w:lineRule="auto"/>
-        <w:jc w:val="both"/>
-      </w:pPr>
-      <w:r>
-        <w:t>Leaderboard: A full-width table of top 10 players with rank, username, and score columns, followed by a personal rank summary card at the bottom.</w:t>
-      </w:r>
-    </w:p>
-    <w:p>
-      <w:pPr>
-        <w:spacing w:after="120" w:line="360" w:lineRule="auto"/>
-        <w:jc w:val="both"/>
-      </w:pPr>
-    </w:p>
-    <w:p>
-      <w:pPr>
-        <w:spacing w:before="80" w:after="80" w:line="360" w:lineRule="auto"/>
-      </w:pPr>
-      <w:r>
-        <w:rPr>
-          <w:i/>
-          <w:iCs/>
-        </w:rPr>
-        <w:t>[INSERT WIREFRAME SKETCHES / FIGMA SCREENSHOTS HERE]</w:t>
-      </w:r>
-    </w:p>
-    <w:p>
-      <w:pPr>
-        <w:spacing w:after="120" w:line="360" w:lineRule="auto"/>
-      </w:pPr>
-    </w:p>
-    <w:p>
-      <w:pPr>
-        <w:pStyle w:val="Heading2"/>
-        <w:spacing w:line="360" w:lineRule="auto"/>
-        <w:rPr>
-          <w:color w:val="auto"/>
-        </w:rPr>
-      </w:pPr>
-      <w:r>
-        <w:rPr>
-          <w:color w:val="auto"/>
-        </w:rPr>
-        <w:t>2.2 Final UI Design</w:t>
-      </w:r>
-    </w:p>
-    <w:p>
-      <w:pPr>
-        <w:spacing w:before="80" w:after="80" w:line="360" w:lineRule="auto"/>
-        <w:ind w:firstLine="720"/>
-        <w:jc w:val="both"/>
-      </w:pPr>
-      <w:r>
-        <w:lastRenderedPageBreak/>
         <w:t xml:space="preserve">The final UI adopted a cosmic/space theme with </w:t>
       </w:r>
       <w:proofErr w:type="spellStart"/>
@@ -1565,6 +1458,70 @@
     </w:p>
     <w:p>
       <w:pPr>
+        <w:pStyle w:val="ListParagraph"/>
+        <w:numPr>
+          <w:ilvl w:val="0"/>
+          <w:numId w:val="2"/>
+        </w:numPr>
+        <w:spacing w:before="40" w:after="40" w:line="360" w:lineRule="auto"/>
+        <w:jc w:val="both"/>
+      </w:pPr>
+      <w:proofErr w:type="spellStart"/>
+      <w:proofErr w:type="spellEnd"/>
+      <w:r>
+        <w:t xml:space="preserve">Blitz Mode Menu (multiplayer.php): A hub for multiplayer flows. Offers Quick Match (auto-matchmaking), Create Room (generates a 6-character room code), and Join Room (enter an existing code). Uses orange neon-blitz buttons to visually distinguish multiplayer entry points from the cyan solo flow.</w:t>
+      </w:r>
+    </w:p>
+    <w:p>
+      <w:pPr>
+        <w:pStyle w:val="ListParagraph"/>
+        <w:numPr>
+          <w:ilvl w:val="0"/>
+          <w:numId w:val="2"/>
+        </w:numPr>
+        <w:spacing w:before="40" w:after="40" w:line="360" w:lineRule="auto"/>
+        <w:jc w:val="both"/>
+      </w:pPr>
+      <w:proofErr w:type="spellStart"/>
+      <w:proofErr w:type="spellEnd"/>
+      <w:r>
+        <w:t xml:space="preserve">Blitz Join Room (blitz_join.php): A focused screen with a single input accepting a 6-character room code. Submits to the Blitz API and displays inline errors (room not found, room full, match already in progress) without a page reload.</w:t>
+      </w:r>
+    </w:p>
+    <w:p>
+      <w:pPr>
+        <w:pStyle w:val="ListParagraph"/>
+        <w:numPr>
+          <w:ilvl w:val="0"/>
+          <w:numId w:val="2"/>
+        </w:numPr>
+        <w:spacing w:before="40" w:after="40" w:line="360" w:lineRule="auto"/>
+        <w:jc w:val="both"/>
+      </w:pPr>
+      <w:proofErr w:type="spellStart"/>
+      <w:proofErr w:type="spellEnd"/>
+      <w:r>
+        <w:t xml:space="preserve">Blitz Room (blitz_room.php): The live multiplayer arena, driven by a phase machine - Waiting (waiting for an opponent to join), Ready (both players must confirm), Countdown (animated 3-2-1 overlay), Game (side-by-side 10x15 canvases with the player's own board on the left and the opponent mirror on the right, a synchronized blitz timer, garbage-line attacks on line clears, and a center HUD), Result (winner declared with a rematch option), Cooldown (brief transition between rounds), and Error (a recoverable error overlay with a return-to-menu fallback).</w:t>
+      </w:r>
+    </w:p>
+    <w:p>
+      <w:pPr>
+        <w:pStyle w:val="ListParagraph"/>
+        <w:numPr>
+          <w:ilvl w:val="0"/>
+          <w:numId w:val="2"/>
+        </w:numPr>
+        <w:spacing w:before="40" w:after="40" w:line="360" w:lineRule="auto"/>
+        <w:jc w:val="both"/>
+      </w:pPr>
+      <w:proofErr w:type="spellStart"/>
+      <w:proofErr w:type="spellEnd"/>
+      <w:r>
+        <w:t xml:space="preserve">Blitz Leaderboard / Rankings (blitz_leaderboard.php): A standalone ranking table that mirrors the solo leaderboard layout but ranks players by Blitz wins. It uses the orange neon-blitz palette and an orange-bordered personal rank card to clearly separate competitive Blitz standings from the cyan solo board.</w:t>
+      </w:r>
+    </w:p>
+    <w:p>
+      <w:pPr>
         <w:spacing w:after="120" w:line="360" w:lineRule="auto"/>
       </w:pPr>
     </w:p>
@@ -1580,7 +1537,156 @@
         <w:rPr>
           <w:color w:val="auto"/>
         </w:rPr>
-        <w:t>2.3 Design Pivot</w:t>
+        <w:t xml:space="preserve">2.2 Admin Side</w:t>
+      </w:r>
+    </w:p>
+    <w:p>
+      <w:pPr>
+        <w:spacing w:before="80" w:after="80" w:line="360" w:lineRule="auto"/>
+        <w:ind w:firstLine="720"/>
+        <w:jc w:val="both"/>
+      </w:pPr>
+      <w:proofErr w:type="spellStart"/>
+      <w:proofErr w:type="spellEnd"/>
+      <w:proofErr w:type="spellStart"/>
+      <w:proofErr w:type="spellEnd"/>
+      <w:r>
+        <w:t xml:space="preserve">The Cosmic Tetris administrative interface is a separate area under the /Admin/ directory, intended for operators rather than players. It is gated by its own session bootstrap (backEnd/admin_session.php) and a dedicated admin_users table; an authenticated player session does not grant admin access. The admin UI reuses the cosmic theme but leans on the pink/magenta accent (#FF007F) instead of the cyan player palette, so an operator can never confuse the two surfaces.</w:t>
+      </w:r>
+    </w:p>
+    <w:p>
+      <w:pPr>
+        <w:spacing w:before="80" w:after="80" w:line="360" w:lineRule="auto"/>
+        <w:ind w:firstLine="720"/>
+        <w:jc w:val="both"/>
+      </w:pPr>
+      <w:proofErr w:type="spellStart"/>
+      <w:proofErr w:type="spellEnd"/>
+      <w:proofErr w:type="spellStart"/>
+      <w:proofErr w:type="spellEnd"/>
+      <w:r>
+        <w:t xml:space="preserve"/>
+      </w:r>
+    </w:p>
+    <w:p>
+      <w:pPr>
+        <w:pStyle w:val="ListParagraph"/>
+        <w:numPr>
+          <w:ilvl w:val="0"/>
+          <w:numId w:val="2"/>
+        </w:numPr>
+        <w:spacing w:before="40" w:after="40" w:line="360" w:lineRule="auto"/>
+        <w:jc w:val="both"/>
+      </w:pPr>
+      <w:proofErr w:type="spellStart"/>
+      <w:proofErr w:type="spellEnd"/>
+      <w:r>
+        <w:t xml:space="preserve">Admin Login (Admin/login.php): A glass card login form scoped to administrators. Credentials are validated against the admin_users table via PDO-prepared statements and password_verify(); on success the session is regenerated and admin_logged_in is set in $_SESSION. Failed attempts produce an inline error.</w:t>
+      </w:r>
+    </w:p>
+    <w:p>
+      <w:pPr>
+        <w:pStyle w:val="ListParagraph"/>
+        <w:numPr>
+          <w:ilvl w:val="0"/>
+          <w:numId w:val="2"/>
+        </w:numPr>
+        <w:spacing w:before="40" w:after="40" w:line="360" w:lineRule="auto"/>
+        <w:jc w:val="both"/>
+      </w:pPr>
+      <w:proofErr w:type="spellStart"/>
+      <w:proofErr w:type="spellEnd"/>
+      <w:r>
+        <w:t xml:space="preserve">Admin Register (Admin/register.php): A bootstrap-only form for creating an administrator account, typically used during initial setup. Enforces unique username/email and stores the password as a bcrypt hash via password_hash().</w:t>
+      </w:r>
+    </w:p>
+    <w:p>
+      <w:pPr>
+        <w:pStyle w:val="ListParagraph"/>
+        <w:numPr>
+          <w:ilvl w:val="0"/>
+          <w:numId w:val="2"/>
+        </w:numPr>
+        <w:spacing w:before="40" w:after="40" w:line="360" w:lineRule="auto"/>
+        <w:jc w:val="both"/>
+      </w:pPr>
+      <w:proofErr w:type="spellStart"/>
+      <w:proofErr w:type="spellEnd"/>
+      <w:r>
+        <w:t xml:space="preserve">Admin Dashboard (Admin/dashboard.php): The control panel. A top stats strip surfaces total players, currently-active players, blocked players, and total Blitz games played. Below it a searchable, paginated player roster lists every registered player with a row-level Block / Unblock action (both CSRF-protected with a per-session admin_csrf token). Two side-by-side panels render the Solo top-10 and Blitz top-10 leaderboards so administrators can audit scores in one view.</w:t>
+      </w:r>
+    </w:p>
+    <w:p>
+      <w:pPr>
+        <w:pStyle w:val="ListParagraph"/>
+        <w:numPr>
+          <w:ilvl w:val="0"/>
+          <w:numId w:val="2"/>
+        </w:numPr>
+        <w:spacing w:before="40" w:after="40" w:line="360" w:lineRule="auto"/>
+        <w:jc w:val="both"/>
+      </w:pPr>
+      <w:proofErr w:type="spellStart"/>
+      <w:proofErr w:type="spellEnd"/>
+      <w:r>
+        <w:t xml:space="preserve">Admin Logout (Admin/logout.php): Unsets the admin session, expires the session cookie, calls session_destroy(), and redirects back to Admin/login.php.</w:t>
+      </w:r>
+    </w:p>
+    <w:p>
+      <w:pPr>
+        <w:spacing w:before="80" w:after="80" w:line="360" w:lineRule="auto"/>
+        <w:ind w:firstLine="720"/>
+        <w:jc w:val="both"/>
+      </w:pPr>
+      <w:proofErr w:type="spellStart"/>
+      <w:proofErr w:type="spellEnd"/>
+      <w:proofErr w:type="spellStart"/>
+      <w:proofErr w:type="spellEnd"/>
+      <w:r>
+        <w:t xml:space="preserve"/>
+      </w:r>
+    </w:p>
+    <w:p>
+      <w:pPr>
+        <w:spacing w:before="80" w:after="80" w:line="360" w:lineRule="auto"/>
+        <w:ind w:firstLine="720"/>
+        <w:jc w:val="both"/>
+      </w:pPr>
+      <w:proofErr w:type="spellStart"/>
+      <w:proofErr w:type="spellEnd"/>
+      <w:proofErr w:type="spellStart"/>
+      <w:proofErr w:type="spellEnd"/>
+      <w:r>
+        <w:t xml:space="preserve">Player-management actions taken from the admin dashboard (block / unblock) immediately affect the next login attempt by that player: a blocked account is rejected at the tetrisgame::LoginUser() step with a generic "Account unavailable" message, which also prevents the block from being used as a user-enumeration oracle.</w:t>
+      </w:r>
+    </w:p>
+    <w:p>
+      <w:pPr>
+        <w:spacing w:before="80" w:after="80" w:line="360" w:lineRule="auto"/>
+        <w:ind w:firstLine="720"/>
+        <w:jc w:val="both"/>
+      </w:pPr>
+      <w:proofErr w:type="spellStart"/>
+      <w:proofErr w:type="spellEnd"/>
+      <w:proofErr w:type="spellStart"/>
+      <w:proofErr w:type="spellEnd"/>
+      <w:r>
+        <w:t xml:space="preserve"/>
+      </w:r>
+    </w:p>
+    <w:p>
+      <w:pPr>
+        <w:pStyle w:val="Heading2"/>
+        <w:spacing w:line="360" w:lineRule="auto"/>
+        <w:rPr>
+          <w:color w:val="auto"/>
+        </w:rPr>
+      </w:pPr>
+      <w:r>
+        <w:rPr>
+          <w:color w:val="auto"/>
+        </w:rPr>
+        <w:t xml:space="preserve">2.3 Design Pivot</w:t>
       </w:r>
     </w:p>
     <w:p>
@@ -11230,7 +11336,6 @@
               <w:spacing w:line="360" w:lineRule="auto"/>
             </w:pPr>
             <w:r>
-              <w:lastRenderedPageBreak/>
               <w:t>rematch_requested_by / rematch_requested_at / rematch_declined</w:t>
             </w:r>
           </w:p>

</xml_diff>